<commit_message>
NFR-3: record the usability check (5 Error: messages, prompts-only walkthrough)
Closes #62
</commit_message>
<xml_diff>
--- a/docs/Test_Plan.docx
+++ b/docs/Test_Plan.docx
@@ -4098,7 +4098,7 @@
               <w:rPr>
                 <w:sz w:val="18"/>
               </w:rPr>
-              <w:t>Inspection</w:t>
+              <w:t>Inspection / usability</w:t>
             </w:r>
           </w:p>
         </w:tc>
@@ -4112,7 +4112,7 @@
               <w:rPr>
                 <w:sz w:val="18"/>
               </w:rPr>
-              <w:t>List every message printed on an error path</w:t>
+              <w:t>List every message printed on an error path, then finish a quiz using only the on-screen prompts</w:t>
             </w:r>
           </w:p>
         </w:tc>
@@ -4126,7 +4126,7 @@
               <w:rPr>
                 <w:sz w:val="18"/>
               </w:rPr>
-              <w:t xml:space="preserve">Each starts with </w:t>
+              <w:t xml:space="preserve">Each error starts with </w:t>
             </w:r>
             <w:r>
               <w:rPr>
@@ -4139,7 +4139,7 @@
               <w:rPr>
                 <w:sz w:val="18"/>
               </w:rPr>
-              <w:t xml:space="preserve"> and is followed by a prompt or the menu</w:t>
+              <w:t xml:space="preserve"> and is followed by a prompt or the menu; every screen has a clear prompt</w:t>
             </w:r>
           </w:p>
         </w:tc>
@@ -4155,6 +4155,25 @@
                 <w:sz w:val="18"/>
               </w:rPr>
               <w:t>Pass</w:t>
+            </w:r>
+            <w:r>
+              <w:rPr>
+                <w:sz w:val="18"/>
+              </w:rPr>
+              <w:t xml:space="preserve"> (5 </w:t>
+            </w:r>
+            <w:r>
+              <w:rPr>
+                <w:rFonts w:ascii="Consolas" w:hAnsi="Consolas" w:eastAsia="Consolas"/>
+                <w:sz w:val="18"/>
+              </w:rPr>
+              <w:t>Error:</w:t>
+            </w:r>
+            <w:r>
+              <w:rPr>
+                <w:sz w:val="18"/>
+              </w:rPr>
+              <w:t xml:space="preserve"> messages; quiz finished with prompts only)</w:t>
             </w:r>
           </w:p>
         </w:tc>

</xml_diff>

<commit_message>
Run all test cases again, add the system test script and the AI use note
Add tests/run_system_tests.sh, which runs the 20 test cases of the Test
Plan against the program. All 20 pass on the final main. Record the
second run, the speed result (NFR-1) and the security checks (NFR-2) in
the Test Plan. Add docs/AI_USE.md and link it from the README.

Closes #65
Closes #60
Closes #61
</commit_message>
<xml_diff>
--- a/docs/Test_Plan.docx
+++ b/docs/Test_Plan.docx
@@ -945,7 +945,34 @@
         <w:t>printf '1\nAsha\n...' | ./quiz</w:t>
       </w:r>
       <w:r>
-        <w:t>), so each run is the same. The output is compared with what the SRS says.</w:t>
+        <w:t xml:space="preserve">), so each run is the same. The output is compared with what the SRS says. All system test cases are scripted in </w:t>
+      </w:r>
+      <w:r>
+        <w:rPr>
+          <w:rFonts w:ascii="Consolas" w:hAnsi="Consolas" w:eastAsia="Consolas"/>
+        </w:rPr>
+        <w:t>tests/run_system_tests.sh</w:t>
+      </w:r>
+      <w:r>
+        <w:t xml:space="preserve"> (run </w:t>
+      </w:r>
+      <w:r>
+        <w:rPr>
+          <w:rFonts w:ascii="Consolas" w:hAnsi="Consolas" w:eastAsia="Consolas"/>
+        </w:rPr>
+        <w:t>make</w:t>
+      </w:r>
+      <w:r>
+        <w:t xml:space="preserve"> and then </w:t>
+      </w:r>
+      <w:r>
+        <w:rPr>
+          <w:rFonts w:ascii="Consolas" w:hAnsi="Consolas" w:eastAsia="Consolas"/>
+        </w:rPr>
+        <w:t>bash tests/run_system_tests.sh</w:t>
+      </w:r>
+      <w:r>
+        <w:t>); it prints PASS or FAIL for each test case.</w:t>
       </w:r>
     </w:p>
     <w:p>
@@ -1805,7 +1832,7 @@
     </w:p>
     <w:p>
       <w:r>
-        <w:t xml:space="preserve">Run on 12-Oct-2026 on </w:t>
+        <w:t xml:space="preserve">First run on 12-Oct-2026 (the quiz engine and leaderboard were not merged yet). Run again on 27-Oct-2026 on the final </w:t>
       </w:r>
       <w:r>
         <w:rPr>
@@ -1814,7 +1841,16 @@
         <w:t>main</w:t>
       </w:r>
       <w:r>
-        <w:t xml:space="preserve"> after the quiz engine was completed, together with the 8 scoring unit tests in </w:t>
+        <w:t xml:space="preserve"> with </w:t>
+      </w:r>
+      <w:r>
+        <w:rPr>
+          <w:rFonts w:ascii="Consolas" w:hAnsi="Consolas" w:eastAsia="Consolas"/>
+        </w:rPr>
+        <w:t>tests/run_system_tests.sh</w:t>
+      </w:r>
+      <w:r>
+        <w:t xml:space="preserve"> and the 8 scoring unit tests in </w:t>
       </w:r>
       <w:r>
         <w:rPr>
@@ -1823,16 +1859,7 @@
         <w:t>tests/test_score.c</w:t>
       </w:r>
       <w:r>
-        <w:t xml:space="preserve">. </w:t>
-      </w:r>
-      <w:r>
-        <w:rPr>
-          <w:b/>
-        </w:rPr>
-        <w:t>Not run</w:t>
-      </w:r>
-      <w:r>
-        <w:t xml:space="preserve"> means planned for Sprint-2.</w:t>
+        <w:t>: all 20 pass. The Result column shows what was observed.</w:t>
       </w:r>
     </w:p>
     <w:tbl>
@@ -4637,6 +4664,22 @@
       </w:r>
       <w:r>
         <w:t>).</w:t>
+      </w:r>
+    </w:p>
+    <w:p>
+      <w:pPr>
+        <w:pStyle w:val="ListBullet"/>
+      </w:pPr>
+      <w:r>
+        <w:t>NFR-1 (speed): a full quiz run took 127 ms and the leaderboard of 100 results took 80 ms, against a limit of 1 second (TC-15).</w:t>
+      </w:r>
+    </w:p>
+    <w:p>
+      <w:pPr>
+        <w:pStyle w:val="ListBullet"/>
+      </w:pPr>
+      <w:r>
+        <w:t>NFR-2 (security): SEC-1 to SEC-6 are checked by TC-05, TC-09, TC-14, TC-16, TC-17 and TC-18, and all pass.</w:t>
       </w:r>
     </w:p>
     <w:p>

</xml_diff>